<commit_message>
Tighten research prose and preserve numerical results
</commit_message>
<xml_diff>
--- a/paper/UNH_ECO402_Paper.docx
+++ b/paper/UNH_ECO402_Paper.docx
@@ -70,7 +70,7 @@
         <w:spacing w:line="240" w:lineRule="auto" w:after="240"/>
       </w:pPr>
       <w:r>
-        <w:t>This paper asks whether the Fama-French risk factors explain UnitedHealth Group's daily excess stock returns. The analysis uses UNH daily returns from Bloomberg historical prices and daily Fama-French factors from 2021-05-03 to 2026-03-31, for 1,234 merged observations. CAPM, FF3, and FF5 models are estimated by ordinary least squares. The main finding is that the market factor is positive and statistically significant in every specification, while UNH's estimated beta remains below one. Alpha is not statistically significant, so the results do not support abnormal excess returns after factor controls. The final FF5 model has an R-squared of about 0.066, meaning the model explains only a modest share of daily excess-return variation. Diagnostics do not detect heteroskedasticity using the Breusch-Pagan and White tests, but residuals are non-normal and fat-tailed. Overall, systematic factors matter, but firm-specific shocks remain important for UNH's daily returns.</w:t>
+        <w:t>Market exposure explains only a small part of UNH's daily excess stock returns. Using Bloomberg historical prices and daily Fama-French factors, this study estimates CAPM, FF3, and FF5 by ordinary least squares for 2021-05-03 to 2026-03-31, with 1,234 observations. The market coefficient is positive, statistically significant, and below one in each model. Alpha is not statistically significant after factor controls. FF5 has an R-squared of about 0.066. The Breusch-Pagan and White tests fail to reject homoskedasticity, while residuals are non-normal and fat-tailed. The models identify market sensitivity but leave most daily return variation unexplained. Firm-specific information may account for some of that variation, although the regressions do not identify the causes of individual shocks.</w:t>
       </w:r>
     </w:p>
     <w:p>
@@ -86,12 +86,9 @@
         <w:spacing w:line="240" w:lineRule="auto" w:after="240"/>
       </w:pPr>
       <w:r>
-        <w:t xml:space="preserve">This paper examines whether the Fama-French risk factors explain UnitedHealth Group's daily excess stock returns. The analysis uses Bloomberg PX_LAST historical price data for UNH and Kenneth French daily five-factor data. The final merged sample covers 2021-05-03 to 2026-03-31 and includes 1,234 observations. Returns and factors are measured in percent, and the dependent variable is UNH_Excess_Return. Three OLS specifications are estimated: CAPM, the Fama-French three-factor model, and the Fama-French five-factor model. Across the specifications, the market coefficient is positive and statistically significant at the 1 percent level, with beta estimates ranging from about 0.41 to 0.51. This indicates that UNH comoves with the market but has below-one market sensitivity. Alpha is approximately -0.04 and is not statistically significant at conventional levels. The FF5 model has an R-squared of 0.0659, which indicates </w:t>
+        <w:t>Daily Bloomberg PX_LAST prices and Kenneth French five-factor data are used to estimate market and non-market exposures in UnitedHealth Group's stock returns. The merged sample covers 2021-05-03 to 2026-03-31 and includes 1,234 observations. Returns and factors are measured in percent, and the dependent variable is UNH_Excess_Return. CAPM, the Fama-French three-factor model, and the Fama-French five-factor model are estimated by OLS on the same sample. The market coefficient is positive and significant at the 1 percent level in every specification, with estimates ranging from about 0.41 to 0.51. Alpha is approximately -0.04 and is not statistically significant. FF5 has an R-squared of 0.0659, so the included factors explain little of the variation in daily excess returns. The Breusch-Pagan and White tests fail to reject homoskedasticity, whereas Anderson-Darling rejects residual normality. HC1 standard errors leave market significance unchanged but weaken the evidence for CMA. The results support below-market sensitivity during the sample, not low total volatility or a complete explanation of UNH's daily movements.</w:t>
       </w:r>
-      <w:r>
-        <w:lastRenderedPageBreak/>
-        <w:t>limited explanatory power for daily single-stock returns. The Breusch-Pagan and White tests fail to reject homoskedasticity, while the Anderson-Darling test rejects normality. Robust HC1 standard errors are reported as a sensitivity check and do not change the main conclusion about the market factor.</w:t>
-      </w:r>
+      <w:r/>
     </w:p>
     <w:p>
       <w:pPr>
@@ -104,26 +101,23 @@
     </w:p>
     <w:p>
       <w:r>
-        <w:t>This paper asks whether the Fama-French risk factors explain UnitedHealth Group's daily excess stock returns. The question matters because factor models are designed to separate systematic market exposure from firm-specific movements. For a single stock such as UNH, this distinction is important. A company can have low estimated market sensitivity and still experience large daily return shocks if firm-specific information is important.</w:t>
+        <w:t>Do the Fama-French risk factors explain UnitedHealth Group's daily excess stock returns? Factor regressions measure how returns vary with broad market and other systematic factors. For a single stock, low market sensitivity can coexist with large daily movements that these factors do not explain.</w:t>
       </w:r>
     </w:p>
     <w:p>
       <w:r>
-        <w:t>UnitedHealth Group is a useful case for this question because it is a large health-care and managed-care company with substantial business scale, broad operating exposure, and visible stock-price movement during the sample. The Bloomberg DES screen classifies UNH as Managed Care and reports a beta versus the S&amp;P 500 Index of 0.61 as May 2026 support context. That market screen is not an input to the regression, but it makes the empirical question natural: if UNH appears low beta in market screens, do the daily return regressions also show below-market sensitivity?</w:t>
+        <w:t>UNH's managed-care business and the sharp stock-price decline during the sample make it a useful case for this comparison. Bloomberg's May 2026 DES screen classifies UNH as Managed Care and reports a beta versus the S&amp;P 500 Index of 0.61. That later snapshot is background information, not a regression input. The analysis asks whether the daily returns also show a market coefficient below one.</w:t>
       </w:r>
     </w:p>
     <w:p>
       <w:r>
-        <w:t xml:space="preserve">The paper answers the question using daily Bloomberg PX_LAST prices and daily Fama-French factors. The data are merged by date, daily returns are computed from closing prices, and the dependent variable is UNH excess return. Three models are estimated: CAPM, FF3, and FF5. This structure allows the paper to compare a market-only model with specifications that add size, </w:t>
+        <w:t>Daily returns are calculated from Bloomberg PX_LAST prices and matched by date to the Fama-French factors. Subtracting the daily risk-free rate gives the dependent variable, UNH excess return. CAPM provides the market-only specification; FF3 and FF5 add size, value, profitability, and investment factors. Estimation and diagnostic testing follow the course OLS framework and the supplied R econometrics text.</w:t>
       </w:r>
-      <w:r>
-        <w:lastRenderedPageBreak/>
-        <w:t>value, profitability, and investment factors. The class OLS framework and the local R econometrics text provide the basic estimation and diagnostic setting for this analysis.</w:t>
-      </w:r>
+      <w:r/>
     </w:p>
     <w:p>
       <w:r>
-        <w:t>The main finding is that the market factor is the strongest and most reliable predictor. It is positive and highly significant in all three models, and its coefficient remains below one. Alpha is not statistically significant in any model. The non-market factors add some joint explanatory power, but the R-squared values remain low. This means that broad factor exposures explain only a modest portion of UNH's daily return variation.</w:t>
+        <w:t>The market factor is significant in all three models, with an estimated coefficient below one. Alpha is insignificant throughout. The non-market factors are jointly significant, but the gain in fit is small. Statistical significance therefore needs to be distinguished from how much daily return variation the models explain.</w:t>
       </w:r>
     </w:p>
     <w:p>
@@ -136,17 +130,17 @@
     </w:p>
     <w:p>
       <w:r>
-        <w:t>UnitedHealth Group Incorporated is the company analyzed in this paper. The local Form 10-Q identifies UnitedHealth Group Incorporated as the registrant and lists UNH common stock on the New York Stock Exchange. The local Bloomberg DES screen classifies the company as Managed Care, lists the headquarters in Eden Prairie, Minnesota, and reports about 390,000 employees. The same screen reports market capitalization of about $364.0 billion, about 908.1 million shares outstanding, a 52-week high of $404.15 on 05/13/26, and a 52-week low of $234.60 on 08/01/25. These Bloomberg values are used only as descriptive support context, not as regression inputs.</w:t>
+        <w:t>UnitedHealth Group Incorporated's Form 10-Q lists UNH common stock on the New York Stock Exchange. Bloomberg's May 2026 DES screen classifies the company as Managed Care, lists its headquarters in Eden Prairie, Minnesota, and reports about 390,000 employees. It reports market capitalization of about $364.0 billion and about 908.1 million shares outstanding. The displayed 52-week high was $404.15 on 05/13/26, and the low was $234.60 on 08/01/25. These figures describe the later company snapshot and are not regression inputs.</w:t>
       </w:r>
     </w:p>
     <w:p>
       <w:r>
-        <w:t>The Bloomberg DES and dividend screens also show a mature-company profile. The DES screen reports a 12-month total return of 33.84 percent, beta versus SPX of 0.61, indicated gross dividend yield of 2.21 percent, five-year net dividend growth of 12.07 percent, trailing 12-month EPS of 15.50, and estimated EPS of 18.36. The dividend screen also reports a 12-month yield of 2.21 percent and five-year dividend growth of 12.07 percent. These facts support the company background, but the paper's statistical evidence comes from the daily return regressions.</w:t>
+        <w:t>The DES screen reports a 12-month total return of 33.84 percent, beta versus SPX of 0.61, indicated gross dividend yield of 2.21 percent, and five-year net dividend growth of 12.07 percent. Trailing 12-month EPS was 15.50, compared with estimated EPS of 18.36. The DVD screen reports the same yield and dividend-growth figures. The dividend history documents distributions to shareholders; it does not establish low stock-return volatility.</w:t>
       </w:r>
     </w:p>
     <w:p>
       <w:r>
-        <w:t>The Bloomberg 2025 revenue breakdown allocates about $312.730 billion to UnitedHealthcare and $130.917 billion to Optum out of $447.567 billion in consolidated revenue, with a separate adjustment category. These displayed allocations are roughly 70 percent and 29 percent of the total. They describe the screen's consolidated revenue allocation, rather than gross segment revenues before eliminations. The business mix provides context for why a broad factor model may leave healthcare-specific and company-specific movements unexplained.</w:t>
+        <w:t>Bloomberg's 2025 revenue breakdown allocates about $312.730 billion to UnitedHealthcare and $130.917 billion to Optum out of $447.567 billion in consolidated revenue, with a separate adjustment category. These allocations are roughly 70 percent and 29 percent of the total. They are allocations of consolidated revenue, not gross segment revenues before eliminations. The two businesses give UNH exposure to different parts of health care.</w:t>
       </w:r>
     </w:p>
     <w:p>
@@ -162,7 +156,7 @@
     </w:p>
     <w:p>
       <w:r>
-        <w:t>The factor-model framework connects this company context to the return data. The CAPM model is UNH_Excess_Return_t = alpha + beta_1 Mkt_RF_t + u_t. The FF5 model is UNH_Excess_Return_t = alpha + beta_1 Mkt_RF_t + beta_2 SMB_t + beta_3 HML_t + beta_4 RMW_t + beta_5 CMA_t + u_t. UNH_Excess_Return is the UNH daily return minus RF. Mkt_RF is the market excess return, SMB is Small Minus Big, HML is High Minus Low, RMW is Robust Minus Weak, CMA is Conservative Minus Aggressive, RF is the risk-free rate, and u_t is the error term.</w:t>
+        <w:t>CAPM relates UNH excess return to market excess return: UNH_Excess_Return_t = alpha + beta_1 Mkt_RF_t + u_t. FF5 adds four factors: UNH_Excess_Return_t = alpha + beta_1 Mkt_RF_t + beta_2 SMB_t + beta_3 HML_t + beta_4 RMW_t + beta_5 CMA_t + u_t. UNH_Excess_Return is the UNH daily return minus RF. Mkt_RF is market excess return, SMB is Small Minus Big, HML is High Minus Low, RMW is Robust Minus Weak, and CMA is Conservative Minus Aggressive. RF is the risk-free rate, and u_t is the error term.</w:t>
       </w:r>
     </w:p>
     <w:p>
@@ -175,7 +169,7 @@
     </w:p>
     <w:p>
       <w:r>
-        <w:t>The empirical analysis uses daily data. UNH prices come from the Bloomberg historical-price file using PX_LAST. The Fama-French factors come from the daily five-factor file. RF also comes from the Fama-French file, not from a Bloomberg Treasury screen. The first return observation is lost because return construction requires the previous trading day's price.</w:t>
+        <w:t>The analysis uses daily Bloomberg PX_LAST prices and the Kenneth French daily five-factor file. RF comes from that same factor file, not a Bloomberg Treasury screen. The first price observation cannot yield a return because it has no preceding trading-day price in the file.</w:t>
       </w:r>
     </w:p>
     <w:p>
@@ -185,12 +179,9 @@
     </w:p>
     <w:p>
       <w:r>
-        <w:t xml:space="preserve">No valid observations were removed, trimmed, or winsorized. Extreme observations are kept because they reflect actual stock return behavior unless there is clear evidence of data error. The </w:t>
+        <w:t>No valid observations were removed, trimmed, or winsorized. Large returns remain in the sample. Residual diagnostics examine their presence, and HC1 standard errors assess sensitivity of inference without changing the OLS coefficients.</w:t>
       </w:r>
-      <w:r>
-        <w:lastRenderedPageBreak/>
-        <w:t>paper handles outliers through diagnostic testing and robust standard errors rather than deleting valid market movements.</w:t>
-      </w:r>
+      <w:r/>
     </w:p>
     <w:p>
       <w:pPr>
@@ -1744,7 +1735,7 @@
     </w:tbl>
     <w:p>
       <w:r>
-        <w:t>Table 1 shows that the mean daily UNH excess return is close to zero and slightly negative, while the median is slightly positive. The standard deviation of 1.980748818 percent is much larger than the mean, which is typical for daily stock-return data. The minimum of -22.39967 percent and maximum of 11.95834 percent show that the series contains large daily movements. This supports caution when interpreting daily return regressions because the average return is small relative to daily volatility.</w:t>
+        <w:t>UNH's mean excess return is slightly negative and its median positive (Table 1). The standard deviation is 1.980748818 percent, with returns ranging from -22.39967 to 11.95834 percent. Daily volatility is large relative to the mean.</w:t>
       </w:r>
     </w:p>
     <w:p>
@@ -1818,7 +1809,7 @@
         <w:rPr>
           <w:sz w:val="22"/>
         </w:rPr>
-        <w:t>Figure 1 shows the UNH daily closing price over the regression sample. The stock traded at relatively high levels through much of 2024 before a sharp decline in 2025. This price path reinforces the importance of firm-specific shocks.</w:t>
+        <w:t>Figure 1 plots UNH's daily closing price over the regression sample. Prices remained relatively high through much of 2024 before falling sharply in 2025. The price chart alone does not identify the cause of the decline.</w:t>
       </w:r>
     </w:p>
     <w:p>
@@ -1891,8 +1882,7 @@
         <w:rPr>
           <w:sz w:val="22"/>
         </w:rPr>
-        <w:lastRenderedPageBreak/>
-        <w:t>Figure 2 shows that daily returns are centered near zero but include large positive and negative observations. These movements help explain why the factor model can be statistically significant while still having low explanatory power.</w:t>
+        <w:t>Most daily returns in Figure 2 lie near zero, but several observations are much larger in either direction. The regression must account for this variation, not just the average return.</w:t>
       </w:r>
     </w:p>
     <w:p>
@@ -3073,7 +3063,7 @@
           </w:tcPr>
           <w:p>
             <w:pPr>
-              <w:keepNext w:val="0"/>
+              <w:keepNext/>
               <w:spacing w:line="240" w:lineRule="auto" w:after="20"/>
             </w:pPr>
             <w:r>
@@ -3098,7 +3088,7 @@
           </w:tcPr>
           <w:p>
             <w:pPr>
-              <w:keepNext w:val="0"/>
+              <w:keepNext/>
               <w:spacing w:line="240" w:lineRule="auto" w:after="20"/>
               <w:jc w:val="center"/>
             </w:pPr>
@@ -3124,7 +3114,7 @@
           </w:tcPr>
           <w:p>
             <w:pPr>
-              <w:keepNext w:val="0"/>
+              <w:keepNext/>
               <w:spacing w:line="240" w:lineRule="auto" w:after="20"/>
               <w:jc w:val="center"/>
             </w:pPr>
@@ -3150,7 +3140,7 @@
           </w:tcPr>
           <w:p>
             <w:pPr>
-              <w:keepNext w:val="0"/>
+              <w:keepNext/>
               <w:spacing w:line="240" w:lineRule="auto" w:after="20"/>
               <w:jc w:val="center"/>
             </w:pPr>
@@ -3194,7 +3184,7 @@
     </w:p>
     <w:p>
       <w:r>
-        <w:t>The model comparison supports a careful interpretation. The non-market factors jointly improve the specification relative to CAPM, with p-value 0.001348 for the joint test that SMB, HML, RMW, and CMA equal zero. However, the added FF5 pair RMW and CMA is only marginal beyond FF3, with p-value 0.05831, and the FF3 to FF5 incremental test has p-value 0.058308. The model is useful, but it is incomplete for single-stock daily returns.</w:t>
+        <w:t>The four non-market factors are jointly significant relative to CAPM, with p-value 0.001348 for the restriction that SMB, HML, RMW, and CMA all equal zero. Beyond FF3, the joint restriction on RMW and CMA has p-value 0.05831. The FF3-to-FF5 comparison reports the same restriction with p-value 0.058308 at greater precision. The incremental evidence for FF5 is therefore marginal at 10 percent, not significant at 5 percent.</w:t>
       </w:r>
     </w:p>
     <w:p>
@@ -3267,14 +3257,12 @@
         <w:rPr>
           <w:sz w:val="22"/>
         </w:rPr>
-        <w:t xml:space="preserve">Figure 3 compares actual UNH excess returns with fitted values from the FF5 model. The fitted values are much smoother than actual returns. This supports the low R-squared interpretation and </w:t>
+        <w:t>Figure 3 compares actual UNH excess returns with the FF5 fitted values. The fitted series varies less and misses the largest daily movements. This is consistent with the low R-squared: the factors capture some variation but leave large residuals.</w:t>
       </w:r>
       <w:r>
         <w:rPr>
           <w:sz w:val="22"/>
         </w:rPr>
-        <w:lastRenderedPageBreak/>
-        <w:t>shows that the model captures some systematic factor movement but does not explain large firm-specific daily shocks.</w:t>
       </w:r>
     </w:p>
     <w:p>
@@ -3287,7 +3275,7 @@
     </w:p>
     <w:p>
       <w:r>
-        <w:t>Table 3 summarizes the diagnostic and robustness checks. The Breusch-Pagan test is the primary heteroskedasticity test in the body. The null hypothesis is that the error variance is constant, meaning homoskedasticity. The decision rule is to reject homoskedasticity if the p-value is below 0.05 and fail to reject if the p-value is at least 0.05.</w:t>
+        <w:t>Table 3 reports the diagnostic tests. The primary heteroskedasticity test is Breusch-Pagan, whose null hypothesis is constant error variance. A p-value below 0.05 leads to rejection; a p-value of at least 0.05 does not. The distinction matters because failing to reject does not prove constant variance.</w:t>
       </w:r>
     </w:p>
     <w:p>
@@ -4104,7 +4092,7 @@
     </w:p>
     <w:p>
       <w:r>
-        <w:t>Robust HC1 standard errors are included as a sensitivity check, not because heteroskedasticity was formally proven. Under robust HC1 standard errors, Mkt_RF remains highly significant, alpha remains insignificant, and SMB, HML, and RMW remain insignificant. CMA changes from significant under conventional standard errors to marginal under robust standard errors, with robust p-value 0.05454. The main conclusion about the market factor does not change. HC1 does not correct serial correlation or reduce the influence of extreme observations on the OLS coefficients.</w:t>
+        <w:t>Appendix Table A3 compares conventional and HC1 inference. Mkt_RF remains highly significant under HC1, while alpha, SMB, HML, and RMW remain insignificant. CMA's robust p-value is 0.05454, weakening its significance relative to conventional standard errors. HC1 is a sensitivity check, not a response to proven heteroskedasticity. It does not correct serial correlation or reduce extreme observations' influence on the OLS coefficients.</w:t>
       </w:r>
     </w:p>
     <w:p>
@@ -4114,7 +4102,7 @@
     </w:p>
     <w:p>
       <w:r>
-        <w:t>The daily return series contains extreme observations. These observations may contribute to non-normal residuals and could raise visual concern in residual plots. The baseline specification retains all valid trading-day observations. Extreme return days are treated as economically meaningful events rather than data errors, so the paper does not mechanically trim the sample.</w:t>
+        <w:t>Extreme returns contribute to the long tails seen in the residual plots. The baseline specification retains all valid trading-day observations. These movements are treated as economically meaningful observations rather than data errors, so the sample is not mechanically trimmed.</w:t>
       </w:r>
     </w:p>
     <w:p>
@@ -4127,23 +4115,23 @@
     </w:p>
     <w:p>
       <w:r>
-        <w:t>The results support a below-one market exposure interpretation. The market coefficient is positive and significant across all models, but it remains below one. This means UNH comoves with the market, but the estimated sensitivity is lower than the market portfolio's one-for-one movement. The result is consistent with the Bloomberg beta screen, but the regression result is the paper's main evidence.</w:t>
+        <w:t>UNH comoves with the market, but its estimated response is less than one-for-one in all three specifications. This is consistent with a defensive market exposure during the sample. The Bloomberg beta screen points in the same direction, though that later snapshot is not an independently estimated version of this regression.</w:t>
       </w:r>
     </w:p>
     <w:p>
       <w:r>
-        <w:t>The peer screens add useful context. UNH traded at a premium to peer medians on P/E, forward P/E, and P/FCF. Its one-year total return was much stronger than the peer median, and its adjusted beta was near 0.61. At the same time, UNH's volatility standard deviation was above the peer median. This distinction matters because low market beta does not mean low total volatility. It fits the low R-squared result because broad market exposure is limited, but total daily variation can still be large.</w:t>
+        <w:t>The May 2026 peer screens show UNH trading above peer medians on P/E, forward P/E, and P/FCF. Its one-year total return was also higher than the peer median. Yet its adjusted beta of about 0.61 coexisted with volatility above the peer median. Low beta describes market sensitivity, not total volatility. These later comparisons illustrate that distinction; they are not additional observations in the factor regressions.</w:t>
       </w:r>
     </w:p>
     <w:p>
       <w:r>
-        <w:t>The earnings file helps explain some of the large residual behavior. Major return days line up with earnings announcements. On 04/17/2025, Q1 2025 reported EPS was 6.863 versus an estimate of 7.274, and the stock price change was -22.38 percent. On 07/29/2025, Q2 2025 reported EPS was 3.776 versus an estimate of 4.589, and the price change was -7.46 percent. On 01/27/2026, Q4 2025 reported EPS was 2.141 versus an estimate of 2.102, and the price change was -19.61 percent. These observations show that some extreme daily returns are real company-event days, not bad data. The workbook distinguishes reported EPS from comparable EPS, and its surprise percentage uses the comparable field. These date matches are descriptive: the negative January return despite reported EPS above the listed estimate shows why an EPS comparison alone cannot identify the cause of a stock-price change.</w:t>
+        <w:t>Three earnings announcements coincide with extreme return days in the merged sample. On 04/17/2025, Q1 2025 reported EPS was 6.863 versus an estimate of 7.274, and the stock price change was -22.38 percent. On 07/29/2025, Q2 2025 reported EPS was 3.776 versus an estimate of 4.589, and the price change was -7.46 percent. On 01/27/2026, Q4 2025 reported EPS was 2.141 versus an estimate of 2.102, and the price change was -19.61 percent. The return file records these large movements on the announcement dates. Bloomberg distinguishes reported from comparable EPS and calculates its surprise percentage using the comparable field. These matches are descriptive. The January decline despite reported EPS above the listed estimate shows why that comparison alone cannot explain the stock's reaction.</w:t>
       </w:r>
       <w:r/>
     </w:p>
     <w:p>
       <w:r>
-        <w:t>The low R-squared values therefore have a clear economic interpretation. The FF5 model captures part of systematic factor movement, especially market exposure, but much of UNH's daily variation remains unexplained. Firm-specific information and omitted short-run shocks are possible contributors; the regression does not identify each residual's cause. The paper does not directly model earnings surprises, regulatory announcements, health-care policy events, litigation news, or analyst revisions. Future work could add those variables to test whether they explain the large residual days.</w:t>
+        <w:t>Most daily variation remains unexplained by FF5. Firm-specific information and other omitted short-run influences may contribute, but the regression cannot identify each residual's cause. Earnings surprises, regulatory announcements, health-care policy events, litigation news, and analyst revisions are not included in the model. Adding dated measures of these events would allow a separate test of their relationship with returns.</w:t>
       </w:r>
     </w:p>
     <w:p>
@@ -4156,18 +4144,17 @@
     </w:p>
     <w:p>
       <w:r>
-        <w:t>This paper tests whether the Fama-French risk factors explain UnitedHealth Group's daily excess stock returns from 2021-05-03 to 2026-03-31. The main finding is that the market factor is positive and highly significant in all specifications. The market coefficient is below one in CAPM, FF3, and FF5, which supports the interpretation that UNH had below-market sensitivity during the sample.</w:t>
+        <w:t>Across CAPM, FF3, and FF5, UNH's market coefficient is positive, highly significant, and below one for 2021-05-03 to 2026-03-31. This estimates market sensitivity, not total volatility.</w:t>
       </w:r>
     </w:p>
     <w:p>
       <w:r>
-        <w:t>The paper does not find significant alpha. The intercept is statistically insignificant in every model, so the results do not support abnormal excess returns after controlling for the included factors. The non-market factors add some joint explanatory power, but individual factor evidence is limited in the FF5 model. SMB, HML, and RMW are not significant in FF5. CMA is significant under conventional standard errors but becomes only marginal under robust HC1 standard errors.</w:t>
+        <w:t>Alpha is insignificant in every model. The non-market factors are jointly significant, but SMB, HML, and RMW are individually insignificant in FF5. CMA is significant conventionally and marginal under HC1, so its evidence is sensitive to the standard errors.</w:t>
       </w:r>
     </w:p>
     <w:p>
       <w:r>
-        <w:lastRenderedPageBreak/>
-        <w:t>The diagnostic results also support a cautious conclusion. The Breusch-Pagan and White tests do not show strong evidence of heteroskedasticity, and robust standard errors do not overturn the main result. VIF values are below 5. Residual normality is rejected, and the Durbin-Watson test suggests weak possible serial correlation at a less strict level but not a 5 percent rejection. Overall, the FF5 model is useful for measuring systematic exposure, but it explains only a modest share of UNH's daily excess-return variation.</w:t>
+        <w:t>Breusch-Pagan and White do not reject homoskedasticity. VIFs are below 5. Residuals are non-normal, and Durbin-Watson indicates weak positive serial correlation without a 5 percent rejection. Most daily excess-return variation remains unexplained.</w:t>
       </w:r>
     </w:p>
     <w:p>

</xml_diff>